<commit_message>
Enforce conclusion links and vertical screenshots
</commit_message>
<xml_diff>
--- a/docs/PoGoskill CMS 文章助手同事试用指南.docx
+++ b/docs/PoGoskill CMS 文章助手同事试用指南.docx
@@ -463,7 +463,7 @@
           <w:rFonts w:ascii="Microsoft YaHei" w:hAnsi="Microsoft YaHei" w:eastAsia="Microsoft YaHei"/>
           <w:sz w:val="19"/>
         </w:rPr>
-        <w:t>使用 `$pogoskill-cms-article-assistant` 完整处理这篇繁中 DOCX。严格使用台湾站 V2 模板和繁体中文；完整保留正文、表格、FAQ、图片、下载区与 Buy Box。DOCX 中指定名称的 Guide 图片从 CMS 图片库精确查找；其他随稿图片保留 JPG/PNG 并生成同名 WebP，成对上传后使用图片上传响应的 publish_id 单独发布图片资源，确认两个前台 URL 均可访问后再回填 HTML。通过 CMS POST API 保存为草稿并回读核对。禁止调用 /cms/page/make，禁止发布文章页面，禁止删除或修改其他文章。没有页面 ID、草稿状态、写入 request_id 和回读 request_id 时，不得声称完成。</w:t>
+        <w:t>使用 `$pogoskill-cms-article-assistant` 完整处理这篇繁中 DOCX。严格使用台湾站 V2 模板和繁体中文；完整保留正文、表格、FAQ、图片、下载区与 Buy Box。结语最后一个首页链接必须使用 DOCX 实际提供的“最佳／最好……”工具关键词作为锚文本，后面的 PoGoskill 保持普通文字，禁止链接品牌名本身。DOCX 中指定名称的 Guide 图片从 CMS 图片库精确查找；其他随稿图片保留 JPG/PNG 并生成同名 WebP，成对上传后使用图片上传响应的 publish_id 单独发布图片资源，确认两个前台 URL 均可访问后再回填 HTML。通过 CMS POST API 保存为草稿并回读核对。禁止调用 /cms/page/make，禁止发布文章页面，禁止删除或修改其他文章。没有页面 ID、草稿状态、写入 request_id 和回读 request_id 时，不得声称完成。</w:t>
       </w:r>
     </w:p>
     <w:p>
@@ -530,7 +530,7 @@
         <w:ind w:left="283"/>
       </w:pPr>
       <w:r>
-        <w:t>复制下面整段提示词：</w:t>
+        <w:t>提示词使用中文，AI 也应使用中文汇报；只有最终文章正文和 HTML 文案保持英文。复制下面整段提示词：</w:t>
       </w:r>
     </w:p>
     <w:p>
@@ -544,7 +544,7 @@
           <w:rFonts w:ascii="Microsoft YaHei" w:hAnsi="Microsoft YaHei" w:eastAsia="Microsoft YaHei"/>
           <w:sz w:val="19"/>
         </w:rPr>
-        <w:t>Use `$pogoskill-cms-en-publisher` to process this complete English DOCX for www.pogoskill.com. Preserve every paragraph, table, FAQ, image, download CTA, and Buy Box, and follow the fixed English V2 HTML contract. Resolve Guide images only by the exact filenames supplied in the DOCX. For other supplied JPG/PNG images, keep the original, create a same-basename WebP, upload both to the correct English CMS folder, publish only the image resources with the publish_id returned by /cms/picture/upload, and verify that both public URLs are readable before inserting them into HTML. Save and read back a CMS draft through POST APIs. Never call /cms/page/make, never publish the article page, and never delete or modify another article. Do not claim completion without the page ID, draft status, write request_id, and readback request_id.</w:t>
+        <w:t>使用 `$pogoskill-cms-en-publisher` 完整处理这篇英文 DOCX，目标站点是 www.pogoskill.com。请用中文汇报执行进度、异常和最终结果，但文章正文与 HTML 文案必须保持自然英文。完整保留每个段落、表格、FAQ、图片、英文下载区和英文 Buy Box，并严格遵守英文 V2 HTML 契约。结语中把 DOCX 实际提供的 best 工具关键词链接到英文站首页，后面的 PoGoskill 品牌名保持普通文字。Guide 图片只按 DOCX 指定的准确文件名查找；其他随稿 JPG/PNG 保留原图并生成同名 WebP，上传到正确的英文站目录，使用 /cms/picture/upload 返回的 publish_id 单独发布图片资源，确认两个前台 URL 可访问后再回填 HTML。英文手机截图必须使用 max-height 和自动宽高，不能使用固定像素 max-width。通过 POST API 保存并回读 CMS 草稿。禁止调用 /cms/page/make，禁止发布文章页面，禁止删除或修改其他文章。没有页面 ID、草稿状态、写入 request_id 和回读 request_id 时，不得声称完成。</w:t>
       </w:r>
     </w:p>
     <w:p>

</xml_diff>

<commit_message>
Document article source and image handoff rules
</commit_message>
<xml_diff>
--- a/docs/PoGoskill CMS 文章助手同事试用指南.docx
+++ b/docs/PoGoskill CMS 文章助手同事试用指南.docx
@@ -69,6 +69,24 @@
       </w:pPr>
       <w:r>
         <w:t>一篇用于试用的 DOCX；一次只测试一种语言的一篇文章。</w:t>
+      </w:r>
+    </w:p>
+    <w:p>
+      <w:pPr>
+        <w:pStyle w:val="ListBullet"/>
+        <w:spacing w:after="60"/>
+      </w:pPr>
+      <w:r>
+        <w:t>DOCX 中已写明参考文章 URL、CMS 页面 ID 或现有 HTML中的至少一项。</w:t>
+      </w:r>
+    </w:p>
+    <w:p>
+      <w:pPr>
+        <w:pStyle w:val="ListBullet"/>
+        <w:spacing w:after="60"/>
+      </w:pPr>
+      <w:r>
+        <w:t>需要上传的正文图片已直接嵌入正文位置；Guide 图片已在对应位置写明 CMS 准确文件名。</w:t>
       </w:r>
     </w:p>
     <w:p>
@@ -390,7 +408,137 @@
         <w:pStyle w:val="Heading1"/>
       </w:pPr>
       <w:r>
-        <w:t>第四部分 试用繁中站文章</w:t>
+        <w:t>第四部分 准备交稿 DOCX</w:t>
+      </w:r>
+    </w:p>
+    <w:p>
+      <w:r>
+        <w:t>正式交给 AI 前，必须把参考样式和图片位置写进同一份 DOCX。不要只在聊天中补充，也不要只发送一个没有位置说明的图片文件夹。</w:t>
+      </w:r>
+    </w:p>
+    <w:p>
+      <w:pPr>
+        <w:keepNext/>
+        <w:spacing w:before="140" w:after="60"/>
+      </w:pPr>
+      <w:r>
+        <w:rPr>
+          <w:rFonts w:ascii="Microsoft YaHei" w:hAnsi="Microsoft YaHei" w:eastAsia="Microsoft YaHei"/>
+          <w:b/>
+          <w:color w:val="1F4E79"/>
+          <w:sz w:val="24"/>
+        </w:rPr>
+        <w:t>第 1 步  提供参考样式</w:t>
+      </w:r>
+    </w:p>
+    <w:p>
+      <w:pPr>
+        <w:spacing w:after="100"/>
+        <w:ind w:left="283"/>
+      </w:pPr>
+      <w:r>
+        <w:t>每篇文章至少提供一种可核验参考：参考文章 URL、CMS 页面 ID 或现有 HTML。建议放在文档开头的“交稿说明”中。AI 会先读取参考页面或 HTML，再复用已有标题、目录、图片、表格、下载区、步骤和 Buy Box 结构，不自行发明页面样式。</w:t>
+      </w:r>
+    </w:p>
+    <w:p>
+      <w:pPr>
+        <w:keepNext/>
+        <w:spacing w:before="140" w:after="60"/>
+      </w:pPr>
+      <w:r>
+        <w:rPr>
+          <w:rFonts w:ascii="Microsoft YaHei" w:hAnsi="Microsoft YaHei" w:eastAsia="Microsoft YaHei"/>
+          <w:b/>
+          <w:color w:val="1F4E79"/>
+          <w:sz w:val="24"/>
+        </w:rPr>
+        <w:t>第 2 步  把新正文图片放到正确位置</w:t>
+      </w:r>
+    </w:p>
+    <w:p>
+      <w:pPr>
+        <w:spacing w:after="100"/>
+        <w:ind w:left="283"/>
+      </w:pPr>
+      <w:r>
+        <w:t>凡是需要上传的新游戏内容图、活动图或正文配图，都直接插入 DOCX 中实际需要出现的位置。图片前后的段落就是 AI 的插图位置。不要只写电脑本地路径，也不要把图片全部堆在文末让 AI 猜位置。AI 会保留 JPG/PNG，再生成同名 WebP 并成对上传。</w:t>
+      </w:r>
+    </w:p>
+    <w:p>
+      <w:pPr>
+        <w:keepNext/>
+        <w:spacing w:before="140" w:after="60"/>
+      </w:pPr>
+      <w:r>
+        <w:rPr>
+          <w:rFonts w:ascii="Microsoft YaHei" w:hAnsi="Microsoft YaHei" w:eastAsia="Microsoft YaHei"/>
+          <w:b/>
+          <w:color w:val="1F4E79"/>
+          <w:sz w:val="24"/>
+        </w:rPr>
+        <w:t>第 3 步  Guide 图片只写 CMS 文件名</w:t>
+      </w:r>
+    </w:p>
+    <w:p>
+      <w:pPr>
+        <w:spacing w:after="100"/>
+        <w:ind w:left="283"/>
+      </w:pPr>
+      <w:r>
+        <w:t>PoGoskill 下载、安装、操作步骤和产品界面等 Guide 图片不需要重新插入或上传。在对应步骤或段落处写出 CMS guides 图片库中的准确文件名，必须包含扩展名。AI 只按该名称精确查找并复用同名原图/WebP，不会根据文字猜图、替换相似图或重新上传 Guide 图。</w:t>
+      </w:r>
+    </w:p>
+    <w:p>
+      <w:r>
+        <w:t>可复制到每篇 DOCX 开头的交稿模板：</w:t>
+      </w:r>
+    </w:p>
+    <w:p>
+      <w:pPr>
+        <w:spacing w:before="80" w:after="160"/>
+        <w:ind w:left="340" w:right="227"/>
+        <w:keepLines/>
+      </w:pPr>
+      <w:r>
+        <w:rPr>
+          <w:rFonts w:ascii="Microsoft YaHei" w:hAnsi="Microsoft YaHei" w:eastAsia="Microsoft YaHei"/>
+          <w:sz w:val="19"/>
+        </w:rPr>
+        <w:t>参考样式：</w:t>
+        <w:br/>
+        <w:t>参考文章 URL / CMS 页面 ID / 现有 HTML：</w:t>
+        <w:br/>
+        <w:br/>
+        <w:t>新上传正文图片：</w:t>
+        <w:br/>
+        <w:t>已直接嵌入 DOCX 对应位置。</w:t>
+        <w:br/>
+        <w:br/>
+        <w:t>Guide 图片：</w:t>
+        <w:br/>
+        <w:t>在对应位置填写 CMS 准确文件名，例如：guide-change-location-step-1.jpg</w:t>
+      </w:r>
+    </w:p>
+    <w:p>
+      <w:r>
+        <w:rPr>
+          <w:rFonts w:ascii="Microsoft YaHei" w:hAnsi="Microsoft YaHei" w:eastAsia="Microsoft YaHei"/>
+          <w:b/>
+          <w:color w:val="1F4E79"/>
+          <w:sz w:val="21"/>
+        </w:rPr>
+        <w:t>示例：</w:t>
+      </w:r>
+      <w:r>
+        <w:t>步骤 1 的文字写完后，另起一行标注“Guide 图片：guide-change-location-step-1.jpg”；需要新上传的活动配图则直接插入该段落下面。</w:t>
+      </w:r>
+    </w:p>
+    <w:p>
+      <w:pPr>
+        <w:pStyle w:val="Heading1"/>
+      </w:pPr>
+      <w:r>
+        <w:t>第五部分 试用繁中站文章</w:t>
       </w:r>
     </w:p>
     <w:p>
@@ -471,7 +619,7 @@
         <w:pStyle w:val="Heading1"/>
       </w:pPr>
       <w:r>
-        <w:t>第五部分 试用英文站文章</w:t>
+        <w:t>第六部分 试用英文站文章</w:t>
       </w:r>
     </w:p>
     <w:p>
@@ -552,7 +700,7 @@
         <w:pStyle w:val="Heading1"/>
       </w:pPr>
       <w:r>
-        <w:t>第六部分 检查是否真的完成</w:t>
+        <w:t>第七部分 检查是否真的完成</w:t>
       </w:r>
     </w:p>
     <w:p>

</xml_diff>

<commit_message>
Persist CMS credentials and checkpoint image uploads
</commit_message>
<xml_diff>
--- a/docs/PoGoskill CMS 文章助手同事试用指南.docx
+++ b/docs/PoGoskill CMS 文章助手同事试用指南.docx
@@ -188,7 +188,7 @@
         <w:ind w:left="283"/>
       </w:pPr>
       <w:r>
-        <w:t>不要把 API Key 发进 AI 聊天，不要写进 Word、邮件正文、代码文件或 GitHub。后面的保存脚本会从剪贴板读取 Key，并存入 Windows Credential Manager。</w:t>
+        <w:t>不要把 API Key 发进 AI 聊天，不要写进 Word、邮件正文、代码文件或 GitHub。后面的保存脚本会从剪贴板读取 Key，写入 Windows DPAPI 加密、仅当前 Windows 用户可读的稳定存储；Windows Credential Manager 可用时也会同时保存。</w:t>
       </w:r>
     </w:p>
     <w:p>
@@ -324,11 +324,7 @@
         <w:keepLines/>
       </w:pPr>
       <w:r>
-        <w:rPr>
-          <w:rFonts w:ascii="Microsoft YaHei" w:hAnsi="Microsoft YaHei" w:eastAsia="Microsoft YaHei"/>
-          <w:sz w:val="19"/>
-        </w:rPr>
-        <w:t>请替我启动 PoGoskill CMS API Key 安全保存程序。先让终端停在“请现在复制完整的 CMS API Key”的提示，再告诉我下一步。不要让我把 Key 粘贴到终端或聊天中。</w:t>
+        <w:t>请替我启动 PoGoskill CMS API Key 安全保存程序。先让终端停在“请现在复制完整的 CMS API Key”的提示，再告诉我下一步。不要让我把 Key 粘贴到终端或聊天中。如果 Windows Credential Manager 返回 1312，但受保护备用存储保存成功，就继续使用备用存储，不要再次索取 Key。</w:t>
       </w:r>
     </w:p>
     <w:p>
@@ -400,7 +396,7 @@
         <w:ind w:left="283"/>
       </w:pPr>
       <w:r>
-        <w:t>AI 应说明凭据已保存到 Windows Credential Manager。此后正常使用无需每篇文章再次提供 Key。</w:t>
+        <w:t>AI 应说明凭据已保存到受保护的当前用户稳定存储；Windows Credential Manager 可用时也会同时保存。插件升级和新任务不会删除该存储，此后正常使用无需每篇文章再次提供 Key。</w:t>
       </w:r>
     </w:p>
     <w:p>
@@ -1210,7 +1206,7 @@
         <w:ind w:left="227"/>
       </w:pPr>
       <w:r>
-        <w:t>先让 AI 检查 Windows Credential Manager 中的 PoGoskillCMS/OpenAPI。凭据存在时不应再次索取。不要把 Key 发到聊天。</w:t>
+        <w:t>让 AI 先运行 scripts/cms-check-api-key.ps1。它会检查受保护本地存储和 Windows Credential Manager，但不会显示 Key。错误 1312 只表示当前进程不能使用 Credential Manager；本地存储有效时应继续。只有两处都没有凭据才重新保存，仍不要把 Key 发到聊天。</w:t>
       </w:r>
     </w:p>
     <w:p>
@@ -1276,7 +1272,7 @@
         <w:ind w:left="227"/>
       </w:pPr>
       <w:r>
-        <w:t>要求它继续执行，并给出真实 endpoint、业务 code、request_id 和页面 ID。没有证据不算完成。</w:t>
+        <w:t>要求它继续执行，并给出真实 endpoint、业务 code、request_id 和页面 ID。图片上传若返回运行会话 ID，必须等待脚本明确退出，再检查 manifest、cms-evidence 和 picture/list；不能把交互终端暂时无输出当作失败，也不能直接重复上传。没有证据不算完成。</w:t>
       </w:r>
     </w:p>
     <w:p>

</xml_diff>

<commit_message>
Make CMS credential setup visible and verifiable
</commit_message>
<xml_diff>
--- a/docs/PoGoskill CMS 文章助手同事试用指南.docx
+++ b/docs/PoGoskill CMS 文章助手同事试用指南.docx
@@ -254,11 +254,7 @@
         <w:keepLines/>
       </w:pPr>
       <w:r>
-        <w:rPr>
-          <w:rFonts w:ascii="Microsoft YaHei" w:hAnsi="Microsoft YaHei" w:eastAsia="Microsoft YaHei"/>
-          <w:sz w:val="19"/>
-        </w:rPr>
-        <w:t>请从 Git 仓库安装 PoGoskill CMS 文章助手：https://github.com/Albzh99/pogoskill-cms-assistant-marketplace.git。按照仓库根目录 SETUP.md 完成 Marketplace 和插件安装。安装完成后告诉我，并提醒我新建一个任务再使用插件。</w:t>
+        <w:t>请从 Git 仓库安装或更新到最新版 PoGoskill CMS 文章助手：https://github.com/Albzh99/pogoskill-cms-assistant-marketplace.git。已安装时先执行 codex plugin marketplace upgrade pogoskill-team，再重新安装插件。按照 SETUP.md 操作，不要复用旧消息中带版本号的缓存路径。完成后提醒我新建任务。</w:t>
       </w:r>
     </w:p>
     <w:p>
@@ -324,7 +320,7 @@
         <w:keepLines/>
       </w:pPr>
       <w:r>
-        <w:t>请替我启动 PoGoskill CMS API Key 安全保存程序。先让终端停在“请现在复制完整的 CMS API Key”的提示，再告诉我下一步。不要让我把 Key 粘贴到终端或聊天中。如果 Windows Credential Manager 返回 1312，但受保护备用存储保存成功，就继续使用备用存储，不要再次索取 Key。</w:t>
+        <w:t>请替我检查 PoGoskill CMS API Key。若确实未保存，请从当前已安装插件根目录启动不带 -Prompt 的保存命令，等出现“请现在复制完整的 CMS API Key”后，把同一个运行会话真正打开到 Codex 可见终端。确认我看得到终端后，再让我复制 Key 并回到终端只按 Enter。进程退出后，立即用同一插件根目录运行 cms-check-api-key.ps1；检查通过才算完成。不要让我手工打开 PowerShell、输入缓存长路径、把 Key 粘贴进终端或发送到聊天。</w:t>
       </w:r>
     </w:p>
     <w:p>
@@ -381,13 +377,7 @@
         <w:spacing w:before="140" w:after="60"/>
       </w:pPr>
       <w:r>
-        <w:rPr>
-          <w:rFonts w:ascii="Microsoft YaHei" w:hAnsi="Microsoft YaHei" w:eastAsia="Microsoft YaHei"/>
-          <w:b/>
-          <w:color w:val="1F4E79"/>
-          <w:sz w:val="24"/>
-        </w:rPr>
-        <w:t>第 4 步  确认保存成功</w:t>
+        <w:t>第 4 步  等待 AI 自动验证</w:t>
       </w:r>
     </w:p>
     <w:p>
@@ -396,7 +386,7 @@
         <w:ind w:left="283"/>
       </w:pPr>
       <w:r>
-        <w:t>AI 应说明凭据已保存到受保护的当前用户稳定存储；Windows Credential Manager 可用时也会同时保存。插件升级和新任务不会删除该存储，此后正常使用无需每篇文章再次提供 Key。</w:t>
+        <w:t>AI 必须继续等待刚才的保存进程退出，再从同一个当前插件根目录运行 cms-check-api-key.ps1。只有它报告凭据可用，才算保存成功。凭据会保存在受保护的稳定存储中；新任务和插件升级不会删除。Windows Credential Manager 出现 1312 时，只要稳定存储与检查脚本正常，就不需要重新输入。</w:t>
       </w:r>
     </w:p>
     <w:p>
@@ -1206,7 +1196,7 @@
         <w:ind w:left="227"/>
       </w:pPr>
       <w:r>
-        <w:t>让 AI 先运行 scripts/cms-check-api-key.ps1。它会检查受保护本地存储和 Windows Credential Manager，但不会显示 Key。错误 1312 只表示当前进程不能使用 Credential Manager；本地存储有效时应继续。只有两处都没有凭据才重新保存，仍不要把 Key 发到聊天。</w:t>
+        <w:t>让 AI 运行当前插件的 scripts/cms-check-api-key.ps1。检查通过后必须继续，禁止再次索取。若它引用带旧版本号的缓存路径，应先更新插件。Windows 1312 不代表稳定存储无效。</w:t>
       </w:r>
     </w:p>
     <w:p>
@@ -1228,7 +1218,7 @@
         <w:ind w:left="227"/>
       </w:pPr>
       <w:r>
-        <w:t>这是正常情况。保存程序的正确操作是：先运行命令，复制 Key 到剪贴板，回到终端只按 Enter。</w:t>
+        <w:t>让 AI 创建并显示可见终端，再复制 Key，回到终端只按 Enter。不能只说“终端已打开”却不给出终端面板，也不能让同事手工输入缓存长路径。默认不要使用需要粘贴输入的 -Prompt。</w:t>
       </w:r>
     </w:p>
     <w:p>
@@ -1272,7 +1262,7 @@
         <w:ind w:left="227"/>
       </w:pPr>
       <w:r>
-        <w:t>要求它继续执行，并给出真实 endpoint、业务 code、request_id 和页面 ID。图片上传若返回运行会话 ID，必须等待脚本明确退出，再检查 manifest、cms-evidence 和 picture/list；不能把交互终端暂时无输出当作失败，也不能直接重复上传。没有证据不算完成。</w:t>
+        <w:t>要求 AI 连续执行并提供 endpoint、业务 code、request_id 和页面 ID。凭据保存与图片上传都必须等待运行会话退出并检查持久证据；不能把后台终端当作结果、重复上传或无证据声称完成。</w:t>
       </w:r>
     </w:p>
     <w:p>

</xml_diff>

<commit_message>
Clarify shared CMS flow and per-site article variables
</commit_message>
<xml_diff>
--- a/docs/PoGoskill CMS 文章助手同事试用指南.docx
+++ b/docs/PoGoskill CMS 文章助手同事试用指南.docx
@@ -8,7 +8,7 @@
         <w:jc w:val="center"/>
       </w:pPr>
       <w:r>
-        <w:t>PoGoskill CMS 文章助手试用指南</w:t>
+        <w:t>CMS 文章助手同事试用指南</w:t>
       </w:r>
     </w:p>
     <w:p>
@@ -27,13 +27,7 @@
     </w:p>
     <w:p>
       <w:r>
-        <w:rPr>
-          <w:b/>
-        </w:rPr>
-        <w:t>这份指南用于完成第一次试用：</w:t>
-      </w:r>
-      <w:r>
-        <w:t>向管理员申请 CMS API Key，让 Codex 安装文章助手，安全保存 Key，然后分别按繁中站或英文站流程上传一篇完整草稿。图片资源会单独发布到云端，但文章页面不会生成或发布。</w:t>
+        <w:t>这份指南帮助团队完成一次配置：向管理员申请目标 CMS 站点的 API Key，让 Codex 安装文章助手并安全保存 Key。之后既可处理 PoGoskill 繁中和英文文章，也可先用几篇旧 HTML 为其他网站建立独立规范，再保存新文章草稿。新图片资源可单独发布到云端；文章页面不会因此生成或发布。</w:t>
       </w:r>
     </w:p>
     <w:p>
@@ -145,7 +139,7 @@
         <w:ind w:left="283"/>
       </w:pPr>
       <w:r>
-        <w:t>向负责 CMS 或中台权限的管理员申请 PoGoskill CMS Open API Key。不要向普通同事索取，也不要使用别人的个人账号密码。</w:t>
+        <w:t>向负责目标 CMS 站点权限的管理员申请 Open API Key；不要向同事借个人账号或密码。</w:t>
       </w:r>
     </w:p>
     <w:p>
@@ -160,11 +154,7 @@
         <w:keepLines/>
       </w:pPr>
       <w:r>
-        <w:rPr>
-          <w:rFonts w:ascii="Microsoft YaHei" w:hAnsi="Microsoft YaHei" w:eastAsia="Microsoft YaHei"/>
-          <w:sz w:val="19"/>
-        </w:rPr>
-        <w:t>请为我开通 PoGoskill CMS Open API，并提供可用于站点、图片、模板、分类、作者、产品、页面草稿以及图片资源发布接口的 API Key。文章只需草稿权限，不需要页面生成或文章发布权限。</w:t>
+        <w:t>请为我开通目标 CMS 站点的 Open API，并提供能读取站点、模板、分类、作者、产品、页面草稿和图片库，以及创建草稿、上传并单独发布图片资源的 API Key。我只处理草稿，不需要文章页面生成或上线发布权限。</w:t>
       </w:r>
     </w:p>
     <w:p>
@@ -524,7 +514,51 @@
         <w:pStyle w:val="Heading1"/>
       </w:pPr>
       <w:r>
-        <w:t>第五部分 试用繁中站文章</w:t>
+        <w:t>第五部分 为其他公司网站建立规范</w:t>
+      </w:r>
+    </w:p>
+    <w:p>
+      <w:pPr/>
+      <w:r>
+        <w:t>第一次处理某个新网站时</w:t>
+      </w:r>
+    </w:p>
+    <w:p>
+      <w:pPr/>
+      <w:r>
+        <w:t>把该网站同类文章的 2–3 篇旧 HTML 上传给 AI；最好再上传待处理的新稿。只需告诉 AI：使用 $cms-site-standard-builder 学习旧 HTML，识别网站，通过 CMS API 核对站点和模板，为这个网站及文章类型建立规范；这一步不上传新文章。</w:t>
+      </w:r>
+    </w:p>
+    <w:p>
+      <w:pPr/>
+      <w:r>
+        <w:t>AI 应从旧 HTML 学习标题、目录、图片盒、尺寸、表格、购买区、下载区等实际结构。作者、URL、标题、关键词、描述、正文等 CMS 字段名和 POST 调用流程共用，但各字段的取值、关联 ID、链接目标及所有页面样式都按本站核对，不能照搬 PoGoskill。新图仍由 CMS API 上传，再用这次图片上传返回的 publish_id 单独发布图片资源。图片目录、格式、公开域名和 HTML 写法则按本站旧文章确定。</w:t>
+      </w:r>
+    </w:p>
+    <w:p>
+      <w:pPr/>
+      <w:r>
+        <w:t>旧 HTML 无法识别网站时，AI 只需问你目标网站网址；不需要你找 CMS ID、填 JSON、运行脚本或修改配置。若几篇旧文章属于不同版式，AI 会分别建立规范，不能拼成一个新样式。</w:t>
+      </w:r>
+    </w:p>
+    <w:p>
+      <w:pPr/>
+      <w:r>
+        <w:t>以后处理该网站的新文章时</w:t>
+      </w:r>
+    </w:p>
+    <w:p>
+      <w:pPr/>
+      <w:r>
+        <w:t>上传新稿并告诉 AI：使用 $cms-site-article-assistant 按刚建立的本站规范处理，完整保留正文和所有图片，检查后通过 CMS API 保存草稿并回读；不要生成或发布文章。没有通过验证的站点规范时，AI 应先完成规范并说明缺口，不能假装已经上传。</w:t>
+      </w:r>
+    </w:p>
+    <w:p>
+      <w:pPr>
+        <w:pStyle w:val="Heading1"/>
+      </w:pPr>
+      <w:r>
+        <w:t>第六部分 试用 PoGoskill 繁中站文章</w:t>
       </w:r>
     </w:p>
     <w:p>
@@ -605,7 +639,7 @@
         <w:pStyle w:val="Heading1"/>
       </w:pPr>
       <w:r>
-        <w:t>第六部分 试用英文站文章</w:t>
+        <w:t>第七部分 试用 PoGoskill 英文站文章</w:t>
       </w:r>
     </w:p>
     <w:p>
@@ -686,7 +720,7 @@
         <w:pStyle w:val="Heading1"/>
       </w:pPr>
       <w:r>
-        <w:t>第七部分 检查是否真的完成</w:t>
+        <w:t>第八部分 检查是否真正完成</w:t>
       </w:r>
     </w:p>
     <w:p>

</xml_diff>